<commit_message>
Fix _norm_var to handle non-string inputs, update BUD path, and add utility scripts
Co-Authored-By: Claude Opus 4.6 (1M context) <noreply@anthropic.com>
</commit_message>
<xml_diff>
--- a/documents/Pidilite Vendor block-unblock BUD 1.3_modified.docx
+++ b/documents/Pidilite Vendor block-unblock BUD 1.3_modified.docx
@@ -431,7 +431,7 @@
               <wp:inline distT="0" distB="0" distL="0" distR="0">
                 <wp:extent cx="1905000" cy="533400"/>
                 <wp:effectExtent l="0" t="0" r="0" b="0"/>
-                <wp:docPr id="3" name="Picture 6" descr="A black and white logo&#10;&#10;Description automatically generated"/>
+                <wp:docPr id="3" name="Picture 6" descr="A black and white logo  Description automatically generated"/>
                 <wp:cNvGraphicFramePr>
                   <a:graphicFrameLocks xmlns:a="http://schemas.openxmlformats.org/drawingml/2006/main" noChangeAspect="1"/>
                 </wp:cNvGraphicFramePr>
@@ -439,7 +439,7 @@
                   <a:graphicData uri="http://schemas.openxmlformats.org/drawingml/2006/picture">
                     <pic:pic xmlns:pic="http://schemas.openxmlformats.org/drawingml/2006/picture">
                       <pic:nvPicPr>
-                        <pic:cNvPr id="3" name="Picture 6" descr="A black and white logo&#10;&#10;Description automatically generated"/>
+                        <pic:cNvPr id="3" name="Picture 6" descr="A black and white logo  Description automatically generated"/>
                         <pic:cNvPicPr>
                           <a:picLocks noChangeAspect="1" noChangeArrowheads="1"/>
                         </pic:cNvPicPr>
@@ -7849,6 +7849,14 @@
               <w:t>Derive company code from "VC_COMPANY_DETAILS" reference table attribute 2, it is dependet on field value of  "Vendor Number" (from Vendor Details panel) Field. Vendor number is attribute 1 of same reference table.</w:t>
             </w:r>
           </w:p>
+          <w:p>
+            <w:r>
+              <w:rPr>
+                <w:sz w:val="18"/>
+              </w:rPr>
+              <w:t>On change of Company Code, clear the “Posting block new” field.</w:t>
+            </w:r>
+          </w:p>
         </w:tc>
       </w:tr>
       <w:tr>
@@ -9761,6 +9769,14 @@
               <w:t>Derive company code from "VC_COMPANY_DETAILS" reference table attribute 2, it depends on field value of  "Vendor Number" Field (from Vendor Details panel). Vendor number is attribute 1 of same reference table.</w:t>
             </w:r>
           </w:p>
+          <w:p>
+            <w:r>
+              <w:rPr>
+                <w:sz w:val="18"/>
+              </w:rPr>
+              <w:t>On change of Company Code, clear the “Payment block New” field.</w:t>
+            </w:r>
+          </w:p>
         </w:tc>
       </w:tr>
       <w:tr>
@@ -11830,6 +11846,14 @@
                 <w:sz w:val="18"/>
               </w:rPr>
               <w:t>Attribute 3 and  it is dependent on the field value of  "Vendor Number" (from the Vendor Details panel) Field</w:t>
+            </w:r>
+          </w:p>
+          <w:p>
+            <w:r>
+              <w:rPr>
+                <w:sz w:val="18"/>
+              </w:rPr>
+              <w:t>On change of Company Code, clear the “Purchase org new” field.</w:t>
             </w:r>
           </w:p>
         </w:tc>
@@ -33121,7 +33145,7 @@
           <wp:extent cx="8277225" cy="598170"/>
           <wp:effectExtent l="0" t="0" r="0" b="0"/>
           <wp:wrapSquare wrapText="bothSides"/>
-          <wp:docPr id="7" name="Image3" descr="A red white and black flag&#10;&#10;Description automatically generated"/>
+          <wp:docPr id="7" name="Image3" descr="A red white and black flag  Description automatically generated"/>
           <wp:cNvGraphicFramePr>
             <a:graphicFrameLocks xmlns:a="http://schemas.openxmlformats.org/drawingml/2006/main" noChangeAspect="1"/>
           </wp:cNvGraphicFramePr>
@@ -33129,7 +33153,7 @@
             <a:graphicData uri="http://schemas.openxmlformats.org/drawingml/2006/picture">
               <pic:pic xmlns:pic="http://schemas.openxmlformats.org/drawingml/2006/picture">
                 <pic:nvPicPr>
-                  <pic:cNvPr id="7" name="Image3" descr="A red white and black flag&#10;&#10;Description automatically generated"/>
+                  <pic:cNvPr id="7" name="Image3" descr="A red white and black flag  Description automatically generated"/>
                   <pic:cNvPicPr>
                     <a:picLocks noChangeAspect="1" noChangeArrowheads="1"/>
                   </pic:cNvPicPr>
@@ -33210,7 +33234,7 @@
           <wp:extent cx="8277225" cy="598170"/>
           <wp:effectExtent l="0" t="0" r="0" b="0"/>
           <wp:wrapSquare wrapText="bothSides"/>
-          <wp:docPr id="8" name="Image4" descr="A red white and black flag&#10;&#10;Description automatically generated"/>
+          <wp:docPr id="8" name="Image4" descr="A red white and black flag  Description automatically generated"/>
           <wp:cNvGraphicFramePr>
             <a:graphicFrameLocks xmlns:a="http://schemas.openxmlformats.org/drawingml/2006/main" noChangeAspect="1"/>
           </wp:cNvGraphicFramePr>
@@ -33218,7 +33242,7 @@
             <a:graphicData uri="http://schemas.openxmlformats.org/drawingml/2006/picture">
               <pic:pic xmlns:pic="http://schemas.openxmlformats.org/drawingml/2006/picture">
                 <pic:nvPicPr>
-                  <pic:cNvPr id="8" name="Image4" descr="A red white and black flag&#10;&#10;Description automatically generated"/>
+                  <pic:cNvPr id="8" name="Image4" descr="A red white and black flag  Description automatically generated"/>
                   <pic:cNvPicPr>
                     <a:picLocks noChangeAspect="1" noChangeArrowheads="1"/>
                   </pic:cNvPicPr>
@@ -36665,6 +36689,14 @@
     </w:lvlOverride>
   </w:num>
 </w:numbering>
+</file>
+
+<file path=word/people.xml><?xml version="1.0" encoding="utf-8"?>
+<w15:people xmlns:w15="http://schemas.microsoft.com/office/word/2012/wordml">
+  <w15:person w15:author="Claude">
+    <w15:presenceInfo w15:providerId="None" w15:userId="Claude"/>
+  </w15:person>
+</w15:people>
 </file>
 
 <file path=word/styles.xml><?xml version="1.0" encoding="utf-8"?>

</xml_diff>